<commit_message>
P_Aula_SA: titulo y trimestre se rellenan siempre desde la tabla de situaciones (EV -> 'Nº trimestre'); en la pestana salen de solo lectura
</commit_message>
<xml_diff>
--- a/templates/programacion_aula_template.docx
+++ b/templates/programacion_aula_template.docx
@@ -1,6 +1,6 @@
 
 <file path=word/document.xml><?xml version="1.0" encoding="utf-8"?>
-<w:document xmlns:wpc="http://schemas.microsoft.com/office/word/2010/wordprocessingCanvas" xmlns:cx="http://schemas.microsoft.com/office/drawing/2014/chartex" xmlns:cx1="http://schemas.microsoft.com/office/drawing/2015/9/8/chartex" xmlns:cx2="http://schemas.microsoft.com/office/drawing/2015/10/21/chartex" xmlns:cx3="http://schemas.microsoft.com/office/drawing/2016/5/9/chartex" xmlns:cx4="http://schemas.microsoft.com/office/drawing/2016/5/10/chartex" xmlns:cx5="http://schemas.microsoft.com/office/drawing/2016/5/11/chartex" xmlns:cx6="http://schemas.microsoft.com/office/drawing/2016/5/12/chartex" xmlns:cx7="http://schemas.microsoft.com/office/drawing/2016/5/13/chartex" xmlns:cx8="http://schemas.microsoft.com/office/drawing/2016/5/14/chartex" xmlns:mc="http://schemas.openxmlformats.org/markup-compatibility/2006" xmlns:aink="http://schemas.microsoft.com/office/drawing/2016/ink" xmlns:am3d="http://schemas.microsoft.com/office/drawing/2017/model3d" xmlns:o="urn:schemas-microsoft-com:office:office" xmlns:oel="http://schemas.microsoft.com/office/2019/extlst" xmlns:r="http://schemas.openxmlformats.org/officeDocument/2006/relationships" xmlns:m="http://schemas.openxmlformats.org/officeDocument/2006/math" xmlns:v="urn:schemas-microsoft-com:vml" xmlns:wp14="http://schemas.microsoft.com/office/word/2010/wordprocessingDrawing" xmlns:wp="http://schemas.openxmlformats.org/drawingml/2006/wordprocessingDrawing" xmlns:w10="urn:schemas-microsoft-com:office:word" xmlns:w="http://schemas.openxmlformats.org/wordprocessingml/2006/main" xmlns:w14="http://schemas.microsoft.com/office/word/2010/wordml" xmlns:w15="http://schemas.microsoft.com/office/word/2012/wordml" xmlns:w16cei="http://schemas.microsoft.com/office/word/2026/wordml/cei" xmlns:w16cex="http://schemas.microsoft.com/office/word/2018/wordml/cex" xmlns:w16cid="http://schemas.microsoft.com/office/word/2016/wordml/cid" xmlns:w16="http://schemas.microsoft.com/office/word/2018/wordml" xmlns:w16du="http://schemas.microsoft.com/office/word/2023/wordml/word16du" xmlns:w16sdtdh="http://schemas.microsoft.com/office/word/2020/wordml/sdtdatahash" xmlns:w16sdtfl="http://schemas.microsoft.com/office/word/2024/wordml/sdtformatlock" xmlns:w16se="http://schemas.microsoft.com/office/word/2015/wordml/symex" xmlns:wpg="http://schemas.microsoft.com/office/word/2010/wordprocessingGroup" xmlns:wpi="http://schemas.microsoft.com/office/word/2010/wordprocessingInk" xmlns:wne="http://schemas.microsoft.com/office/word/2006/wordml" xmlns:wps="http://schemas.microsoft.com/office/word/2010/wordprocessingShape" mc:Ignorable="w14 w15 w16se w16cid w16 w16cex w16sdtdh w16sdtfl w16du wp14">
+<w:document xmlns:wpc="http://schemas.microsoft.com/office/word/2010/wordprocessingCanvas" xmlns:cx="http://schemas.microsoft.com/office/drawing/2014/chartex" xmlns:cx1="http://schemas.microsoft.com/office/drawing/2015/9/8/chartex" xmlns:cx2="http://schemas.microsoft.com/office/drawing/2015/10/21/chartex" xmlns:cx3="http://schemas.microsoft.com/office/drawing/2016/5/9/chartex" xmlns:cx4="http://schemas.microsoft.com/office/drawing/2016/5/10/chartex" xmlns:cx5="http://schemas.microsoft.com/office/drawing/2016/5/11/chartex" xmlns:cx6="http://schemas.microsoft.com/office/drawing/2016/5/12/chartex" xmlns:cx7="http://schemas.microsoft.com/office/drawing/2016/5/13/chartex" xmlns:cx8="http://schemas.microsoft.com/office/drawing/2016/5/14/chartex" xmlns:mc="http://schemas.openxmlformats.org/markup-compatibility/2006" xmlns:aink="http://schemas.microsoft.com/office/drawing/2016/ink" xmlns:am3d="http://schemas.microsoft.com/office/drawing/2017/model3d" xmlns:o="urn:schemas-microsoft-com:office:office" xmlns:oel="http://schemas.microsoft.com/office/2019/extlst" xmlns:r="http://schemas.openxmlformats.org/officeDocument/2006/relationships" xmlns:m="http://schemas.openxmlformats.org/officeDocument/2006/math" xmlns:v="urn:schemas-microsoft-com:vml" xmlns:wp14="http://schemas.microsoft.com/office/word/2010/wordprocessingDrawing" xmlns:wp="http://schemas.openxmlformats.org/drawingml/2006/wordprocessingDrawing" xmlns:w10="urn:schemas-microsoft-com:office:word" xmlns:w="http://schemas.openxmlformats.org/wordprocessingml/2006/main" xmlns:w14="http://schemas.microsoft.com/office/word/2010/wordml" xmlns:w15="http://schemas.microsoft.com/office/word/2012/wordml" xmlns:w16cex="http://schemas.microsoft.com/office/word/2018/wordml/cex" xmlns:w16cid="http://schemas.microsoft.com/office/word/2016/wordml/cid" xmlns:w16="http://schemas.microsoft.com/office/word/2018/wordml" xmlns:w16du="http://schemas.microsoft.com/office/word/2023/wordml/word16du" xmlns:w16sdtdh="http://schemas.microsoft.com/office/word/2020/wordml/sdtdatahash" xmlns:w16sdtfl="http://schemas.microsoft.com/office/word/2024/wordml/sdtformatlock" xmlns:w16se="http://schemas.microsoft.com/office/word/2015/wordml/symex" xmlns:wpg="http://schemas.microsoft.com/office/word/2010/wordprocessingGroup" xmlns:wpi="http://schemas.microsoft.com/office/word/2010/wordprocessingInk" xmlns:wne="http://schemas.microsoft.com/office/word/2006/wordml" xmlns:wps="http://schemas.microsoft.com/office/word/2010/wordprocessingShape" mc:Ignorable="w14 w15 w16se w16cid w16 w16cex w16sdtdh w16sdtfl w16du wp14">
   <w:body>
     <w:sdt>
       <w:sdtPr>
@@ -19,7 +19,7 @@
             <mc:AlternateContent>
               <mc:Choice Requires="wpg">
                 <w:drawing>
-                  <wp:anchor distT="0" distB="0" distL="114300" distR="114300" simplePos="0" relativeHeight="251659264" behindDoc="0" locked="0" layoutInCell="1" allowOverlap="1" wp14:anchorId="511D080F" wp14:editId="0066E22C">
+                  <wp:anchor distT="0" distB="0" distL="114300" distR="114300" simplePos="0" relativeHeight="251659264" behindDoc="0" locked="0" layoutInCell="1" allowOverlap="1" wp14:anchorId="511D080F" wp14:editId="21615CC2">
                     <wp:simplePos x="0" y="0"/>
                     <wp:positionH relativeFrom="page">
                       <wp:align>right</wp:align>
@@ -58,7 +58,7 @@
                                 <a:avLst/>
                               </a:prstGeom>
                               <a:solidFill>
-                                <a:schemeClr val="accent2"/>
+                                <a:srgbClr val="00B0F0"/>
                               </a:solidFill>
                               <a:extLst>
                                 <a:ext uri="{91240B29-F687-4F45-9708-019B960494DF}">
@@ -124,45 +124,16 @@
                             </wps:spPr>
                             <wps:txbx>
                               <w:txbxContent>
-                                <w:sdt>
-                                  <w:sdtPr>
+                                <w:p>
+                                  <w:pPr>
+                                    <w:pStyle w:val="Sinespaciado"/>
                                     <w:rPr>
                                       <w:color w:val="FFFFFF" w:themeColor="background1"/>
                                       <w:sz w:val="96"/>
                                       <w:szCs w:val="96"/>
                                     </w:rPr>
-                                    <w:alias w:val="Año"/>
-                                    <w:id w:val="1012341074"/>
-                                    <w:showingPlcHdr/>
-                                    <w:dataBinding w:prefixMappings="xmlns:ns0='http://schemas.microsoft.com/office/2006/coverPageProps'" w:xpath="/ns0:CoverPageProperties[1]/ns0:PublishDate[1]" w:storeItemID="{55AF091B-3C7A-41E3-B477-F2FDAA23CFDA}"/>
-                                    <w:date>
-                                      <w:dateFormat w:val="yyyy"/>
-                                      <w:lid w:val="es-ES"/>
-                                      <w:storeMappedDataAs w:val="dateTime"/>
-                                      <w:calendar w:val="gregorian"/>
-                                    </w:date>
-                                  </w:sdtPr>
-                                  <w:sdtContent>
-                                    <w:p>
-                                      <w:pPr>
-                                        <w:pStyle w:val="Sinespaciado"/>
-                                        <w:rPr>
-                                          <w:color w:val="FFFFFF" w:themeColor="background1"/>
-                                          <w:sz w:val="96"/>
-                                          <w:szCs w:val="96"/>
-                                        </w:rPr>
-                                      </w:pPr>
-                                      <w:r>
-                                        <w:rPr>
-                                          <w:color w:val="FFFFFF" w:themeColor="background1"/>
-                                          <w:sz w:val="96"/>
-                                          <w:szCs w:val="96"/>
-                                        </w:rPr>
-                                        <w:t>[Año]</w:t>
-                                      </w:r>
-                                    </w:p>
-                                  </w:sdtContent>
-                                </w:sdt>
+                                  </w:pPr>
+                                </w:p>
                               </w:txbxContent>
                             </wps:txbx>
                             <wps:bodyPr rot="0" vert="horz" wrap="square" lIns="365760" tIns="182880" rIns="182880" bIns="182880" anchor="b" anchorCtr="0" upright="1">
@@ -216,68 +187,27 @@
                             </wps:spPr>
                             <wps:txbx>
                               <w:txbxContent>
-                                <w:sdt>
-                                  <w:sdtPr>
+                                <w:p>
+                                  <w:pPr>
+                                    <w:pStyle w:val="Sinespaciado"/>
+                                    <w:spacing w:line="360" w:lineRule="auto"/>
                                     <w:rPr>
                                       <w:color w:val="FFFFFF" w:themeColor="background1"/>
                                     </w:rPr>
-                                    <w:alias w:val="Autor"/>
-                                    <w:id w:val="1380359617"/>
-                                    <w:dataBinding w:prefixMappings="xmlns:ns0='http://schemas.openxmlformats.org/package/2006/metadata/core-properties' xmlns:ns1='http://purl.org/dc/elements/1.1/'" w:xpath="/ns0:coreProperties[1]/ns1:creator[1]" w:storeItemID="{6C3C8BC8-F283-45AE-878A-BAB7291924A1}"/>
-                                    <w:text/>
-                                  </w:sdtPr>
-                                  <w:sdtContent>
-                                    <w:p>
-                                      <w:pPr>
-                                        <w:pStyle w:val="Sinespaciado"/>
-                                        <w:spacing w:line="360" w:lineRule="auto"/>
-                                        <w:rPr>
-                                          <w:color w:val="FFFFFF" w:themeColor="background1"/>
-                                        </w:rPr>
-                                      </w:pPr>
-                                      <w:r>
-                                        <w:rPr>
-                                          <w:color w:val="FFFFFF" w:themeColor="background1"/>
-                                        </w:rPr>
-                                        <w:t>Ángel Pardos Blas</w:t>
-                                      </w:r>
-                                    </w:p>
-                                  </w:sdtContent>
-                                </w:sdt>
-                                <w:sdt>
-                                  <w:sdtPr>
+                                  </w:pPr>
+                                  <w:r>
                                     <w:rPr>
                                       <w:color w:val="FFFFFF" w:themeColor="background1"/>
                                     </w:rPr>
-                                    <w:alias w:val="Fecha"/>
-                                    <w:id w:val="1724480474"/>
-                                    <w:showingPlcHdr/>
-                                    <w:dataBinding w:prefixMappings="xmlns:ns0='http://schemas.microsoft.com/office/2006/coverPageProps'" w:xpath="/ns0:CoverPageProperties[1]/ns0:PublishDate[1]" w:storeItemID="{55AF091B-3C7A-41E3-B477-F2FDAA23CFDA}"/>
-                                    <w:date>
-                                      <w:dateFormat w:val="d-M-yyyy"/>
-                                      <w:lid w:val="es-ES"/>
-                                      <w:storeMappedDataAs w:val="dateTime"/>
-                                      <w:calendar w:val="gregorian"/>
-                                    </w:date>
-                                  </w:sdtPr>
-                                  <w:sdtContent>
-                                    <w:p>
-                                      <w:pPr>
-                                        <w:pStyle w:val="Sinespaciado"/>
-                                        <w:spacing w:line="360" w:lineRule="auto"/>
-                                        <w:rPr>
-                                          <w:color w:val="FFFFFF" w:themeColor="background1"/>
-                                        </w:rPr>
-                                      </w:pPr>
-                                      <w:r>
-                                        <w:rPr>
-                                          <w:color w:val="FFFFFF" w:themeColor="background1"/>
-                                        </w:rPr>
-                                        <w:t>[Fecha]</w:t>
-                                      </w:r>
-                                    </w:p>
-                                  </w:sdtContent>
-                                </w:sdt>
+                                    <w:t>{{ docente }}</w:t>
+                                  </w:r>
+                                  <w:r>
+                                    <w:rPr>
+                                      <w:color w:val="FFFFFF" w:themeColor="background1"/>
+                                    </w:rPr>
+                                    <w:br/>
+                                  </w:r>
+                                </w:p>
                               </w:txbxContent>
                             </wps:txbx>
                             <wps:bodyPr rot="0" vert="horz" wrap="square" lIns="365760" tIns="182880" rIns="182880" bIns="182880" anchor="b" anchorCtr="0" upright="1">
@@ -298,52 +228,23 @@
               </mc:Choice>
               <mc:Fallback>
                 <w:pict>
-                  <v:group w14:anchorId="511D080F" id="Grupo 252" o:spid="_x0000_s1026" style="position:absolute;margin-left:193.95pt;margin-top:0;width:245.15pt;height:11in;z-index:251659264;mso-width-percent:400;mso-height-percent:1000;mso-position-horizontal:right;mso-position-horizontal-relative:page;mso-position-vertical:top;mso-position-vertical-relative:page;mso-width-percent:400;mso-height-percent:1000" coordsize="31136,100584" o:gfxdata="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">
-                    <v:rect id="Rectángulo 460" o:spid="_x0000_s1027" style="position:absolute;left:1246;width:29718;height:100584;visibility:visible;mso-wrap-style:square;v-text-anchor:top" o:gfxdata="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" fillcolor="#e97132 [3205]" stroked="f" strokecolor="#d8d8d8"/>
+                  <v:group w14:anchorId="511D080F" id="Grupo 252" o:spid="_x0000_s1026" style="position:absolute;margin-left:193.95pt;margin-top:0;width:245.15pt;height:11in;z-index:251659264;mso-width-percent:400;mso-height-percent:1000;mso-position-horizontal:right;mso-position-horizontal-relative:page;mso-position-vertical:top;mso-position-vertical-relative:page;mso-width-percent:400;mso-height-percent:1000" coordsize="31136,100584" o:gfxdata="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">
+                    <v:rect id="Rectángulo 460" o:spid="_x0000_s1027" style="position:absolute;left:1246;width:29718;height:100584;visibility:visible;mso-wrap-style:square;v-text-anchor:top" o:gfxdata="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" fillcolor="#00b0f0" stroked="f" strokecolor="#d8d8d8"/>
                     <v:rect id="Rectángulo 461" o:spid="_x0000_s1028" style="position:absolute;left:138;width:30998;height:23774;visibility:visible;mso-wrap-style:square;v-text-anchor:bottom" o:gfxdata="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" filled="f" stroked="f" strokecolor="white" strokeweight="1pt">
                       <v:fill opacity="52428f"/>
                       <v:shadow color="#d8d8d8" offset="3pt,3pt"/>
                       <v:textbox inset="28.8pt,14.4pt,14.4pt,14.4pt">
                         <w:txbxContent>
-                          <w:sdt>
-                            <w:sdtPr>
+                          <w:p>
+                            <w:pPr>
+                              <w:pStyle w:val="Sinespaciado"/>
                               <w:rPr>
                                 <w:color w:val="FFFFFF" w:themeColor="background1"/>
                                 <w:sz w:val="96"/>
                                 <w:szCs w:val="96"/>
                               </w:rPr>
-                              <w:alias w:val="Año"/>
-                              <w:id w:val="1012341074"/>
-                              <w:showingPlcHdr/>
-                              <w:dataBinding w:prefixMappings="xmlns:ns0='http://schemas.microsoft.com/office/2006/coverPageProps'" w:xpath="/ns0:CoverPageProperties[1]/ns0:PublishDate[1]" w:storeItemID="{55AF091B-3C7A-41E3-B477-F2FDAA23CFDA}"/>
-                              <w:date>
-                                <w:dateFormat w:val="yyyy"/>
-                                <w:lid w:val="es-ES"/>
-                                <w:storeMappedDataAs w:val="dateTime"/>
-                                <w:calendar w:val="gregorian"/>
-                              </w:date>
-                            </w:sdtPr>
-                            <w:sdtContent>
-                              <w:p>
-                                <w:pPr>
-                                  <w:pStyle w:val="Sinespaciado"/>
-                                  <w:rPr>
-                                    <w:color w:val="FFFFFF" w:themeColor="background1"/>
-                                    <w:sz w:val="96"/>
-                                    <w:szCs w:val="96"/>
-                                  </w:rPr>
-                                </w:pPr>
-                                <w:r>
-                                  <w:rPr>
-                                    <w:color w:val="FFFFFF" w:themeColor="background1"/>
-                                    <w:sz w:val="96"/>
-                                    <w:szCs w:val="96"/>
-                                  </w:rPr>
-                                  <w:t>[Año]</w:t>
-                                </w:r>
-                              </w:p>
-                            </w:sdtContent>
-                          </w:sdt>
+                            </w:pPr>
+                          </w:p>
                         </w:txbxContent>
                       </v:textbox>
                     </v:rect>
@@ -352,68 +253,27 @@
                       <v:shadow color="#d8d8d8" offset="3pt,3pt"/>
                       <v:textbox inset="28.8pt,14.4pt,14.4pt,14.4pt">
                         <w:txbxContent>
-                          <w:sdt>
-                            <w:sdtPr>
+                          <w:p>
+                            <w:pPr>
+                              <w:pStyle w:val="Sinespaciado"/>
+                              <w:spacing w:line="360" w:lineRule="auto"/>
                               <w:rPr>
                                 <w:color w:val="FFFFFF" w:themeColor="background1"/>
                               </w:rPr>
-                              <w:alias w:val="Autor"/>
-                              <w:id w:val="1380359617"/>
-                              <w:dataBinding w:prefixMappings="xmlns:ns0='http://schemas.openxmlformats.org/package/2006/metadata/core-properties' xmlns:ns1='http://purl.org/dc/elements/1.1/'" w:xpath="/ns0:coreProperties[1]/ns1:creator[1]" w:storeItemID="{6C3C8BC8-F283-45AE-878A-BAB7291924A1}"/>
-                              <w:text/>
-                            </w:sdtPr>
-                            <w:sdtContent>
-                              <w:p>
-                                <w:pPr>
-                                  <w:pStyle w:val="Sinespaciado"/>
-                                  <w:spacing w:line="360" w:lineRule="auto"/>
-                                  <w:rPr>
-                                    <w:color w:val="FFFFFF" w:themeColor="background1"/>
-                                  </w:rPr>
-                                </w:pPr>
-                                <w:r>
-                                  <w:rPr>
-                                    <w:color w:val="FFFFFF" w:themeColor="background1"/>
-                                  </w:rPr>
-                                  <w:t>Ángel Pardos Blas</w:t>
-                                </w:r>
-                              </w:p>
-                            </w:sdtContent>
-                          </w:sdt>
-                          <w:sdt>
-                            <w:sdtPr>
+                            </w:pPr>
+                            <w:r>
                               <w:rPr>
                                 <w:color w:val="FFFFFF" w:themeColor="background1"/>
                               </w:rPr>
-                              <w:alias w:val="Fecha"/>
-                              <w:id w:val="1724480474"/>
-                              <w:showingPlcHdr/>
-                              <w:dataBinding w:prefixMappings="xmlns:ns0='http://schemas.microsoft.com/office/2006/coverPageProps'" w:xpath="/ns0:CoverPageProperties[1]/ns0:PublishDate[1]" w:storeItemID="{55AF091B-3C7A-41E3-B477-F2FDAA23CFDA}"/>
-                              <w:date>
-                                <w:dateFormat w:val="d-M-yyyy"/>
-                                <w:lid w:val="es-ES"/>
-                                <w:storeMappedDataAs w:val="dateTime"/>
-                                <w:calendar w:val="gregorian"/>
-                              </w:date>
-                            </w:sdtPr>
-                            <w:sdtContent>
-                              <w:p>
-                                <w:pPr>
-                                  <w:pStyle w:val="Sinespaciado"/>
-                                  <w:spacing w:line="360" w:lineRule="auto"/>
-                                  <w:rPr>
-                                    <w:color w:val="FFFFFF" w:themeColor="background1"/>
-                                  </w:rPr>
-                                </w:pPr>
-                                <w:r>
-                                  <w:rPr>
-                                    <w:color w:val="FFFFFF" w:themeColor="background1"/>
-                                  </w:rPr>
-                                  <w:t>[Fecha]</w:t>
-                                </w:r>
-                              </w:p>
-                            </w:sdtContent>
-                          </w:sdt>
+                              <w:t>{{ docente }}</w:t>
+                            </w:r>
+                            <w:r>
+                              <w:rPr>
+                                <w:color w:val="FFFFFF" w:themeColor="background1"/>
+                              </w:rPr>
+                              <w:br/>
+                            </w:r>
+                          </w:p>
                         </w:txbxContent>
                       </v:textbox>
                     </v:rect>
@@ -488,27 +348,18 @@
                                 <w:pPr>
                                   <w:jc w:val="right"/>
                                   <w:rPr>
+                                    <w:b/>
                                     <w:sz w:val="36"/>
                                     <w:szCs w:val="36"/>
                                   </w:rPr>
                                 </w:pPr>
-                                <w:proofErr w:type="gramStart"/>
                                 <w:r>
                                   <w:rPr>
                                     <w:b/>
                                     <w:sz w:val="36"/>
                                     <w:szCs w:val="36"/>
                                   </w:rPr>
-                                  <w:t>{{ materia</w:t>
-                                </w:r>
-                                <w:proofErr w:type="gramEnd"/>
-                                <w:r>
-                                  <w:rPr>
-                                    <w:b/>
-                                    <w:sz w:val="36"/>
-                                    <w:szCs w:val="36"/>
-                                  </w:rPr>
-                                  <w:t xml:space="preserve"> }} </w:t>
+                                  <w:t xml:space="preserve">{{ materia }} </w:t>
                                 </w:r>
                                 <w:r>
                                   <w:rPr>
@@ -518,41 +369,21 @@
                                   </w:rPr>
                                   <w:br/>
                                 </w:r>
-                                <w:proofErr w:type="gramStart"/>
                                 <w:r>
                                   <w:rPr>
                                     <w:b/>
                                     <w:sz w:val="36"/>
                                     <w:szCs w:val="36"/>
                                   </w:rPr>
-                                  <w:t>{{ curso</w:t>
+                                  <w:t>{{ curso }} – {{ grupo }}</w:t>
                                 </w:r>
-                                <w:proofErr w:type="gramEnd"/>
                                 <w:r>
                                   <w:rPr>
                                     <w:b/>
                                     <w:sz w:val="36"/>
                                     <w:szCs w:val="36"/>
                                   </w:rPr>
-                                  <w:t xml:space="preserve"> }} – </w:t>
-                                </w:r>
-                                <w:proofErr w:type="gramStart"/>
-                                <w:r>
-                                  <w:rPr>
-                                    <w:b/>
-                                    <w:sz w:val="36"/>
-                                    <w:szCs w:val="36"/>
-                                  </w:rPr>
-                                  <w:t>{{ grupo</w:t>
-                                </w:r>
-                                <w:proofErr w:type="gramEnd"/>
-                                <w:r>
-                                  <w:rPr>
-                                    <w:b/>
-                                    <w:sz w:val="36"/>
-                                    <w:szCs w:val="36"/>
-                                  </w:rPr>
-                                  <w:t xml:space="preserve"> }}</w:t>
+                                  <w:t xml:space="preserve"> – Curso: {{ años }}</w:t>
                                 </w:r>
                               </w:p>
                               <w:p/>
@@ -586,27 +417,18 @@
                           <w:pPr>
                             <w:jc w:val="right"/>
                             <w:rPr>
+                              <w:b/>
                               <w:sz w:val="36"/>
                               <w:szCs w:val="36"/>
                             </w:rPr>
                           </w:pPr>
-                          <w:proofErr w:type="gramStart"/>
                           <w:r>
                             <w:rPr>
                               <w:b/>
                               <w:sz w:val="36"/>
                               <w:szCs w:val="36"/>
                             </w:rPr>
-                            <w:t>{{ materia</w:t>
-                          </w:r>
-                          <w:proofErr w:type="gramEnd"/>
-                          <w:r>
-                            <w:rPr>
-                              <w:b/>
-                              <w:sz w:val="36"/>
-                              <w:szCs w:val="36"/>
-                            </w:rPr>
-                            <w:t xml:space="preserve"> }} </w:t>
+                            <w:t xml:space="preserve">{{ materia }} </w:t>
                           </w:r>
                           <w:r>
                             <w:rPr>
@@ -616,41 +438,21 @@
                             </w:rPr>
                             <w:br/>
                           </w:r>
-                          <w:proofErr w:type="gramStart"/>
                           <w:r>
                             <w:rPr>
                               <w:b/>
                               <w:sz w:val="36"/>
                               <w:szCs w:val="36"/>
                             </w:rPr>
-                            <w:t>{{ curso</w:t>
+                            <w:t>{{ curso }} – {{ grupo }}</w:t>
                           </w:r>
-                          <w:proofErr w:type="gramEnd"/>
                           <w:r>
                             <w:rPr>
                               <w:b/>
                               <w:sz w:val="36"/>
                               <w:szCs w:val="36"/>
                             </w:rPr>
-                            <w:t xml:space="preserve"> }} – </w:t>
-                          </w:r>
-                          <w:proofErr w:type="gramStart"/>
-                          <w:r>
-                            <w:rPr>
-                              <w:b/>
-                              <w:sz w:val="36"/>
-                              <w:szCs w:val="36"/>
-                            </w:rPr>
-                            <w:t>{{ grupo</w:t>
-                          </w:r>
-                          <w:proofErr w:type="gramEnd"/>
-                          <w:r>
-                            <w:rPr>
-                              <w:b/>
-                              <w:sz w:val="36"/>
-                              <w:szCs w:val="36"/>
-                            </w:rPr>
-                            <w:t xml:space="preserve"> }}</w:t>
+                            <w:t xml:space="preserve"> – Curso: {{ años }}</w:t>
                           </w:r>
                         </w:p>
                         <w:p/>
@@ -928,6 +730,15 @@
     </w:p>
     <w:sdt>
       <w:sdtPr>
+        <w:rPr>
+          <w:rFonts w:asciiTheme="minorHAnsi" w:eastAsiaTheme="minorHAnsi" w:hAnsiTheme="minorHAnsi" w:cstheme="minorBidi"/>
+          <w:color w:val="auto"/>
+          <w:kern w:val="2"/>
+          <w:sz w:val="22"/>
+          <w:szCs w:val="22"/>
+          <w:lang w:eastAsia="en-US"/>
+          <w14:ligatures w14:val="standardContextual"/>
+        </w:rPr>
         <w:id w:val="-1287807645"/>
         <w:docPartObj>
           <w:docPartGallery w:val="Table of Contents"/>
@@ -936,15 +747,8 @@
       </w:sdtPr>
       <w:sdtEndPr>
         <w:rPr>
-          <w:rFonts w:asciiTheme="minorHAnsi" w:eastAsiaTheme="minorHAnsi" w:hAnsiTheme="minorHAnsi" w:cstheme="minorBidi"/>
           <w:b/>
           <w:bCs/>
-          <w:color w:val="auto"/>
-          <w:kern w:val="2"/>
-          <w:sz w:val="22"/>
-          <w:szCs w:val="22"/>
-          <w:lang w:eastAsia="en-US"/>
-          <w14:ligatures w14:val="standardContextual"/>
         </w:rPr>
       </w:sdtEndPr>
       <w:sdtContent>
@@ -1422,13 +1226,8 @@
         <w:lastRenderedPageBreak/>
         <w:t xml:space="preserve">Docente: </w:t>
       </w:r>
-      <w:proofErr w:type="gramStart"/>
-      <w:r>
-        <w:t>{{ docente</w:t>
-      </w:r>
-      <w:proofErr w:type="gramEnd"/>
-      <w:r>
-        <w:t xml:space="preserve"> }}</w:t>
+      <w:r>
+        <w:t>{{ docente }}</w:t>
       </w:r>
     </w:p>
     <w:p>
@@ -1450,29 +1249,16 @@
         </w:rPr>
         <w:t xml:space="preserve">Número de alumnos: </w:t>
       </w:r>
-      <w:proofErr w:type="gramStart"/>
       <w:r>
         <w:t xml:space="preserve">{{ </w:t>
       </w:r>
       <w:proofErr w:type="spellStart"/>
       <w:r>
-        <w:t>numero</w:t>
-      </w:r>
-      <w:proofErr w:type="gramEnd"/>
-      <w:r>
-        <w:t>_</w:t>
-      </w:r>
-      <w:proofErr w:type="gramStart"/>
-      <w:r>
-        <w:t>alumnos</w:t>
+        <w:t>numero_alumnos</w:t>
       </w:r>
       <w:proofErr w:type="spellEnd"/>
       <w:r>
-        <w:t xml:space="preserve"> }</w:t>
-      </w:r>
-      <w:proofErr w:type="gramEnd"/>
-      <w:r>
-        <w:t>}</w:t>
+        <w:t xml:space="preserve"> }}</w:t>
       </w:r>
     </w:p>
     <w:p>
@@ -1482,29 +1268,16 @@
         </w:rPr>
         <w:t xml:space="preserve">Alumnado que requiere atención individualizada: </w:t>
       </w:r>
-      <w:proofErr w:type="gramStart"/>
       <w:r>
         <w:t xml:space="preserve">{{ </w:t>
       </w:r>
       <w:proofErr w:type="spellStart"/>
       <w:r>
-        <w:t>alumnos</w:t>
-      </w:r>
-      <w:proofErr w:type="gramEnd"/>
-      <w:r>
-        <w:t>_atencion_</w:t>
-      </w:r>
-      <w:proofErr w:type="gramStart"/>
-      <w:r>
-        <w:t>individualizada</w:t>
+        <w:t>alumnos_atencion_individualizada</w:t>
       </w:r>
       <w:proofErr w:type="spellEnd"/>
       <w:r>
-        <w:t xml:space="preserve"> }</w:t>
-      </w:r>
-      <w:proofErr w:type="gramEnd"/>
-      <w:r>
-        <w:t>}</w:t>
+        <w:t xml:space="preserve"> }}</w:t>
       </w:r>
     </w:p>
     <w:p>
@@ -1514,29 +1287,16 @@
         </w:rPr>
         <w:t xml:space="preserve">Características físicas, cognitivas y afectivas del grupo: </w:t>
       </w:r>
-      <w:proofErr w:type="gramStart"/>
       <w:r>
         <w:t xml:space="preserve">{{ </w:t>
       </w:r>
       <w:proofErr w:type="spellStart"/>
       <w:r>
-        <w:t>caracteristicas</w:t>
-      </w:r>
-      <w:proofErr w:type="gramEnd"/>
-      <w:r>
-        <w:t>_fisicas_cognitivas_</w:t>
-      </w:r>
-      <w:proofErr w:type="gramStart"/>
-      <w:r>
-        <w:t>afectivas</w:t>
+        <w:t>caracteristicas_fisicas_cognitivas_afectivas</w:t>
       </w:r>
       <w:proofErr w:type="spellEnd"/>
       <w:r>
-        <w:t xml:space="preserve"> }</w:t>
-      </w:r>
-      <w:proofErr w:type="gramEnd"/>
-      <w:r>
-        <w:t>}</w:t>
+        <w:t xml:space="preserve"> }}</w:t>
       </w:r>
     </w:p>
     <w:p>
@@ -1546,29 +1306,16 @@
         </w:rPr>
         <w:t xml:space="preserve">Nivel de competencia curricular: </w:t>
       </w:r>
-      <w:proofErr w:type="gramStart"/>
       <w:r>
         <w:t xml:space="preserve">{{ </w:t>
       </w:r>
       <w:proofErr w:type="spellStart"/>
       <w:r>
-        <w:t>nivel</w:t>
-      </w:r>
-      <w:proofErr w:type="gramEnd"/>
-      <w:r>
-        <w:t>_competencia_</w:t>
-      </w:r>
-      <w:proofErr w:type="gramStart"/>
-      <w:r>
-        <w:t>curricular</w:t>
+        <w:t>nivel_competencia_curricular</w:t>
       </w:r>
       <w:proofErr w:type="spellEnd"/>
       <w:r>
-        <w:t xml:space="preserve"> }</w:t>
-      </w:r>
-      <w:proofErr w:type="gramEnd"/>
-      <w:r>
-        <w:t>}</w:t>
+        <w:t xml:space="preserve"> }}</w:t>
       </w:r>
     </w:p>
     <w:p>
@@ -1578,29 +1325,16 @@
         </w:rPr>
         <w:t xml:space="preserve">Otras características: </w:t>
       </w:r>
-      <w:proofErr w:type="gramStart"/>
       <w:r>
         <w:t xml:space="preserve">{{ </w:t>
       </w:r>
       <w:proofErr w:type="spellStart"/>
       <w:r>
-        <w:t>otras</w:t>
-      </w:r>
-      <w:proofErr w:type="gramEnd"/>
-      <w:r>
-        <w:t>_caracteristicas_</w:t>
-      </w:r>
-      <w:proofErr w:type="gramStart"/>
-      <w:r>
-        <w:t>grupo</w:t>
+        <w:t>otras_caracteristicas_grupo</w:t>
       </w:r>
       <w:proofErr w:type="spellEnd"/>
       <w:r>
-        <w:t xml:space="preserve"> }</w:t>
-      </w:r>
-      <w:proofErr w:type="gramEnd"/>
-      <w:r>
-        <w:t>}</w:t>
+        <w:t xml:space="preserve"> }}</w:t>
       </w:r>
     </w:p>
     <w:p>
@@ -1630,29 +1364,16 @@
         </w:rPr>
         <w:t xml:space="preserve">Resultados: </w:t>
       </w:r>
-      <w:proofErr w:type="gramStart"/>
       <w:r>
         <w:t xml:space="preserve">{{ </w:t>
       </w:r>
       <w:proofErr w:type="spellStart"/>
       <w:r>
-        <w:t>resultados</w:t>
-      </w:r>
-      <w:proofErr w:type="gramEnd"/>
-      <w:r>
-        <w:t>_evaluacion_</w:t>
-      </w:r>
-      <w:proofErr w:type="gramStart"/>
-      <w:r>
-        <w:t>inicial</w:t>
+        <w:t>resultados_evaluacion_inicial</w:t>
       </w:r>
       <w:proofErr w:type="spellEnd"/>
       <w:r>
-        <w:t xml:space="preserve"> }</w:t>
-      </w:r>
-      <w:proofErr w:type="gramEnd"/>
-      <w:r>
-        <w:t>}</w:t>
+        <w:t xml:space="preserve"> }}</w:t>
       </w:r>
     </w:p>
     <w:p>
@@ -1662,29 +1383,16 @@
         </w:rPr>
         <w:t xml:space="preserve">Conclusiones: </w:t>
       </w:r>
-      <w:proofErr w:type="gramStart"/>
       <w:r>
         <w:t xml:space="preserve">{{ </w:t>
       </w:r>
       <w:proofErr w:type="spellStart"/>
       <w:r>
-        <w:t>conclusiones</w:t>
-      </w:r>
-      <w:proofErr w:type="gramEnd"/>
-      <w:r>
-        <w:t>_evaluacion_</w:t>
-      </w:r>
-      <w:proofErr w:type="gramStart"/>
-      <w:r>
-        <w:t>inicial</w:t>
+        <w:t>conclusiones_evaluacion_inicial</w:t>
       </w:r>
       <w:proofErr w:type="spellEnd"/>
       <w:r>
-        <w:t xml:space="preserve"> }</w:t>
-      </w:r>
-      <w:proofErr w:type="gramEnd"/>
-      <w:r>
-        <w:t>}</w:t>
+        <w:t xml:space="preserve"> }}</w:t>
       </w:r>
     </w:p>
     <w:p>
@@ -1733,55 +1441,23 @@
       <w:bookmarkStart w:id="6" w:name="_Toc236808407"/>
       <w:bookmarkStart w:id="7" w:name="_Toc236895668"/>
       <w:r>
-        <w:t xml:space="preserve">Situación de aprendizaje </w:t>
-      </w:r>
-      <w:proofErr w:type="gramStart"/>
-      <w:r>
-        <w:t xml:space="preserve">{{ </w:t>
+        <w:t xml:space="preserve">Situación de aprendizaje {{ </w:t>
       </w:r>
       <w:proofErr w:type="spellStart"/>
       <w:r>
-        <w:t>situacion</w:t>
-      </w:r>
-      <w:proofErr w:type="gramEnd"/>
-      <w:r>
-        <w:t>.</w:t>
-      </w:r>
-      <w:proofErr w:type="gramStart"/>
-      <w:r>
-        <w:t>numero</w:t>
+        <w:t>situacion.numero</w:t>
       </w:r>
       <w:proofErr w:type="spellEnd"/>
       <w:r>
-        <w:t xml:space="preserve"> }</w:t>
-      </w:r>
-      <w:proofErr w:type="gramEnd"/>
-      <w:r>
-        <w:t xml:space="preserve">}: </w:t>
-      </w:r>
-      <w:proofErr w:type="gramStart"/>
-      <w:r>
-        <w:t xml:space="preserve">{{ </w:t>
+        <w:t xml:space="preserve"> }}: {{ </w:t>
       </w:r>
       <w:proofErr w:type="spellStart"/>
       <w:r>
-        <w:t>situacion</w:t>
-      </w:r>
-      <w:proofErr w:type="gramEnd"/>
-      <w:r>
-        <w:t>.</w:t>
-      </w:r>
-      <w:proofErr w:type="gramStart"/>
-      <w:r>
-        <w:t>titulo</w:t>
+        <w:t>situacion.titulo</w:t>
       </w:r>
       <w:proofErr w:type="spellEnd"/>
       <w:r>
-        <w:t xml:space="preserve"> }</w:t>
-      </w:r>
-      <w:proofErr w:type="gramEnd"/>
-      <w:r>
-        <w:t>}</w:t>
+        <w:t xml:space="preserve"> }}</w:t>
       </w:r>
       <w:bookmarkEnd w:id="6"/>
       <w:bookmarkEnd w:id="7"/>
@@ -1793,29 +1469,16 @@
         </w:rPr>
         <w:t xml:space="preserve">Trimestre: </w:t>
       </w:r>
-      <w:proofErr w:type="gramStart"/>
       <w:r>
         <w:t xml:space="preserve">{{ </w:t>
       </w:r>
       <w:proofErr w:type="spellStart"/>
       <w:r>
-        <w:t>situacion</w:t>
-      </w:r>
-      <w:proofErr w:type="gramEnd"/>
-      <w:r>
-        <w:t>.</w:t>
-      </w:r>
-      <w:proofErr w:type="gramStart"/>
-      <w:r>
-        <w:t>trimestre</w:t>
+        <w:t>situacion.trimestre</w:t>
       </w:r>
       <w:proofErr w:type="spellEnd"/>
       <w:r>
-        <w:t xml:space="preserve"> }</w:t>
-      </w:r>
-      <w:proofErr w:type="gramEnd"/>
-      <w:r>
-        <w:t>}</w:t>
+        <w:t xml:space="preserve"> }}</w:t>
       </w:r>
     </w:p>
     <w:p>
@@ -1825,29 +1488,16 @@
         </w:rPr>
         <w:t xml:space="preserve">Contextualización: </w:t>
       </w:r>
-      <w:proofErr w:type="gramStart"/>
       <w:r>
         <w:t xml:space="preserve">{{ </w:t>
       </w:r>
       <w:proofErr w:type="spellStart"/>
       <w:r>
-        <w:t>situacion</w:t>
-      </w:r>
-      <w:proofErr w:type="gramEnd"/>
-      <w:r>
-        <w:t>.</w:t>
-      </w:r>
-      <w:proofErr w:type="gramStart"/>
-      <w:r>
-        <w:t>contextualizacion</w:t>
+        <w:t>situacion.contextualizacion</w:t>
       </w:r>
       <w:proofErr w:type="spellEnd"/>
       <w:r>
-        <w:t xml:space="preserve"> }</w:t>
-      </w:r>
-      <w:proofErr w:type="gramEnd"/>
-      <w:r>
-        <w:t>}</w:t>
+        <w:t xml:space="preserve"> }}</w:t>
       </w:r>
     </w:p>
     <w:p>
@@ -1865,29 +1515,16 @@
         </w:rPr>
         <w:t xml:space="preserve">Contenidos de la materia: </w:t>
       </w:r>
-      <w:proofErr w:type="gramStart"/>
       <w:r>
         <w:t xml:space="preserve">{{ </w:t>
       </w:r>
       <w:proofErr w:type="spellStart"/>
       <w:r>
-        <w:t>situacion</w:t>
-      </w:r>
-      <w:proofErr w:type="gramEnd"/>
-      <w:r>
-        <w:t>.contenidos_</w:t>
-      </w:r>
-      <w:proofErr w:type="gramStart"/>
-      <w:r>
-        <w:t>materia</w:t>
+        <w:t>situacion.contenidos_materia</w:t>
       </w:r>
       <w:proofErr w:type="spellEnd"/>
       <w:r>
-        <w:t xml:space="preserve"> }</w:t>
-      </w:r>
-      <w:proofErr w:type="gramEnd"/>
-      <w:r>
-        <w:t>}</w:t>
+        <w:t xml:space="preserve"> }}</w:t>
       </w:r>
     </w:p>
     <w:p>
@@ -1897,29 +1534,16 @@
         </w:rPr>
         <w:t xml:space="preserve">Contenidos de carácter transversal: </w:t>
       </w:r>
-      <w:proofErr w:type="gramStart"/>
       <w:r>
         <w:t xml:space="preserve">{{ </w:t>
       </w:r>
       <w:proofErr w:type="spellStart"/>
       <w:r>
-        <w:t>situacion</w:t>
-      </w:r>
-      <w:proofErr w:type="gramEnd"/>
-      <w:r>
-        <w:t>.contenidos_</w:t>
-      </w:r>
-      <w:proofErr w:type="gramStart"/>
-      <w:r>
-        <w:t>transversales</w:t>
+        <w:t>situacion.contenidos_transversales</w:t>
       </w:r>
       <w:proofErr w:type="spellEnd"/>
       <w:r>
-        <w:t xml:space="preserve"> }</w:t>
-      </w:r>
-      <w:proofErr w:type="gramEnd"/>
-      <w:r>
-        <w:t>}</w:t>
+        <w:t xml:space="preserve"> }}</w:t>
       </w:r>
     </w:p>
     <w:p>
@@ -1929,29 +1553,16 @@
         </w:rPr>
         <w:t xml:space="preserve">Aprendizaje interdisciplinar: </w:t>
       </w:r>
-      <w:proofErr w:type="gramStart"/>
       <w:r>
         <w:t xml:space="preserve">{{ </w:t>
       </w:r>
       <w:proofErr w:type="spellStart"/>
       <w:r>
-        <w:t>situacion</w:t>
-      </w:r>
-      <w:proofErr w:type="gramEnd"/>
-      <w:r>
-        <w:t>.aprendizaje_</w:t>
-      </w:r>
-      <w:proofErr w:type="gramStart"/>
-      <w:r>
-        <w:t>interdisciplinar</w:t>
+        <w:t>situacion.aprendizaje_interdisciplinar</w:t>
       </w:r>
       <w:proofErr w:type="spellEnd"/>
       <w:r>
-        <w:t xml:space="preserve"> }</w:t>
-      </w:r>
-      <w:proofErr w:type="gramEnd"/>
-      <w:r>
-        <w:t>}</w:t>
+        <w:t xml:space="preserve"> }}</w:t>
       </w:r>
     </w:p>
     <w:p>
@@ -1969,29 +1580,16 @@
         </w:rPr>
         <w:t xml:space="preserve">Métodos (estilos, estrategias y técnicas): </w:t>
       </w:r>
-      <w:proofErr w:type="gramStart"/>
       <w:r>
         <w:t xml:space="preserve">{{ </w:t>
       </w:r>
       <w:proofErr w:type="spellStart"/>
       <w:r>
-        <w:t>situacion</w:t>
-      </w:r>
-      <w:proofErr w:type="gramEnd"/>
-      <w:r>
-        <w:t>.</w:t>
-      </w:r>
-      <w:proofErr w:type="gramStart"/>
-      <w:r>
-        <w:t>metodos</w:t>
+        <w:t>situacion.metodos</w:t>
       </w:r>
       <w:proofErr w:type="spellEnd"/>
       <w:r>
-        <w:t xml:space="preserve"> }</w:t>
-      </w:r>
-      <w:proofErr w:type="gramEnd"/>
-      <w:r>
-        <w:t>}</w:t>
+        <w:t xml:space="preserve"> }}</w:t>
       </w:r>
     </w:p>
     <w:p>
@@ -2001,29 +1599,16 @@
         </w:rPr>
         <w:t xml:space="preserve">Organización del alumnado y agrupamientos: </w:t>
       </w:r>
-      <w:proofErr w:type="gramStart"/>
       <w:r>
         <w:t xml:space="preserve">{{ </w:t>
       </w:r>
       <w:proofErr w:type="spellStart"/>
       <w:r>
-        <w:t>situacion</w:t>
-      </w:r>
-      <w:proofErr w:type="gramEnd"/>
-      <w:r>
-        <w:t>.organizacion_</w:t>
-      </w:r>
-      <w:proofErr w:type="gramStart"/>
-      <w:r>
-        <w:t>alumnado</w:t>
+        <w:t>situacion.organizacion_alumnado</w:t>
       </w:r>
       <w:proofErr w:type="spellEnd"/>
       <w:r>
-        <w:t xml:space="preserve"> }</w:t>
-      </w:r>
-      <w:proofErr w:type="gramEnd"/>
-      <w:r>
-        <w:t>}</w:t>
+        <w:t xml:space="preserve"> }}</w:t>
       </w:r>
     </w:p>
     <w:p>
@@ -2033,29 +1618,16 @@
         </w:rPr>
         <w:t xml:space="preserve">Cronograma y organización del tiempo: </w:t>
       </w:r>
-      <w:proofErr w:type="gramStart"/>
       <w:r>
         <w:t xml:space="preserve">{{ </w:t>
       </w:r>
       <w:proofErr w:type="spellStart"/>
       <w:r>
-        <w:t>situacion</w:t>
-      </w:r>
-      <w:proofErr w:type="gramEnd"/>
-      <w:r>
-        <w:t>.</w:t>
-      </w:r>
-      <w:proofErr w:type="gramStart"/>
-      <w:r>
-        <w:t>cronograma</w:t>
+        <w:t>situacion.cronograma</w:t>
       </w:r>
       <w:proofErr w:type="spellEnd"/>
       <w:r>
-        <w:t xml:space="preserve"> }</w:t>
-      </w:r>
-      <w:proofErr w:type="gramEnd"/>
-      <w:r>
-        <w:t>}</w:t>
+        <w:t xml:space="preserve"> }}</w:t>
       </w:r>
     </w:p>
     <w:p>
@@ -2065,29 +1637,16 @@
         </w:rPr>
         <w:t xml:space="preserve">Organización del espacio: </w:t>
       </w:r>
-      <w:proofErr w:type="gramStart"/>
       <w:r>
         <w:t xml:space="preserve">{{ </w:t>
       </w:r>
       <w:proofErr w:type="spellStart"/>
       <w:r>
-        <w:t>situacion</w:t>
-      </w:r>
-      <w:proofErr w:type="gramEnd"/>
-      <w:r>
-        <w:t>.organizacion_</w:t>
-      </w:r>
-      <w:proofErr w:type="gramStart"/>
-      <w:r>
-        <w:t>espacio</w:t>
+        <w:t>situacion.organizacion_espacio</w:t>
       </w:r>
       <w:proofErr w:type="spellEnd"/>
       <w:r>
-        <w:t xml:space="preserve"> }</w:t>
-      </w:r>
-      <w:proofErr w:type="gramEnd"/>
-      <w:r>
-        <w:t>}</w:t>
+        <w:t xml:space="preserve"> }}</w:t>
       </w:r>
     </w:p>
     <w:p>
@@ -2097,29 +1656,16 @@
         </w:rPr>
         <w:t xml:space="preserve">Materiales y recursos: </w:t>
       </w:r>
-      <w:proofErr w:type="gramStart"/>
       <w:r>
         <w:t xml:space="preserve">{{ </w:t>
       </w:r>
       <w:proofErr w:type="spellStart"/>
       <w:r>
-        <w:t>situacion</w:t>
-      </w:r>
-      <w:proofErr w:type="gramEnd"/>
-      <w:r>
-        <w:t>.materiales_</w:t>
-      </w:r>
-      <w:proofErr w:type="gramStart"/>
-      <w:r>
-        <w:t>recursos</w:t>
+        <w:t>situacion.materiales_recursos</w:t>
       </w:r>
       <w:proofErr w:type="spellEnd"/>
       <w:r>
-        <w:t xml:space="preserve"> }</w:t>
-      </w:r>
-      <w:proofErr w:type="gramEnd"/>
-      <w:r>
-        <w:t>}</w:t>
+        <w:t xml:space="preserve"> }}</w:t>
       </w:r>
     </w:p>
     <w:p>
@@ -2137,29 +1683,16 @@
         </w:rPr>
         <w:t xml:space="preserve">Atención a las diferencias individuales: </w:t>
       </w:r>
-      <w:proofErr w:type="gramStart"/>
       <w:r>
         <w:t xml:space="preserve">{{ </w:t>
       </w:r>
       <w:proofErr w:type="spellStart"/>
       <w:r>
-        <w:t>situacion</w:t>
-      </w:r>
-      <w:proofErr w:type="gramEnd"/>
-      <w:r>
-        <w:t>.atencion_</w:t>
-      </w:r>
-      <w:proofErr w:type="gramStart"/>
-      <w:r>
-        <w:t>diferencias</w:t>
+        <w:t>situacion.atencion_diferencias</w:t>
       </w:r>
       <w:proofErr w:type="spellEnd"/>
       <w:r>
-        <w:t xml:space="preserve"> }</w:t>
-      </w:r>
-      <w:proofErr w:type="gramEnd"/>
-      <w:r>
-        <w:t>}</w:t>
+        <w:t xml:space="preserve"> }}</w:t>
       </w:r>
     </w:p>
     <w:p>
@@ -2169,29 +1702,16 @@
         </w:rPr>
         <w:t xml:space="preserve">Medidas de planes específicos y adaptaciones curriculares: </w:t>
       </w:r>
-      <w:proofErr w:type="gramStart"/>
       <w:r>
         <w:t xml:space="preserve">{{ </w:t>
       </w:r>
       <w:proofErr w:type="spellStart"/>
       <w:r>
-        <w:t>situacion</w:t>
-      </w:r>
-      <w:proofErr w:type="gramEnd"/>
-      <w:r>
-        <w:t>.medidas_</w:t>
-      </w:r>
-      <w:proofErr w:type="gramStart"/>
-      <w:r>
-        <w:t>especificas</w:t>
+        <w:t>situacion.medidas_especificas</w:t>
       </w:r>
       <w:proofErr w:type="spellEnd"/>
       <w:r>
-        <w:t xml:space="preserve"> }</w:t>
-      </w:r>
-      <w:proofErr w:type="gramEnd"/>
-      <w:r>
-        <w:t>}</w:t>
+        <w:t xml:space="preserve"> }}</w:t>
       </w:r>
     </w:p>
     <w:p>
@@ -2201,29 +1721,16 @@
         </w:rPr>
         <w:t xml:space="preserve">Proceso de evaluación: </w:t>
       </w:r>
-      <w:proofErr w:type="gramStart"/>
       <w:r>
         <w:t xml:space="preserve">{{ </w:t>
       </w:r>
       <w:proofErr w:type="spellStart"/>
       <w:r>
-        <w:t>situacion</w:t>
-      </w:r>
-      <w:proofErr w:type="gramEnd"/>
-      <w:r>
-        <w:t>.proceso_</w:t>
-      </w:r>
-      <w:proofErr w:type="gramStart"/>
-      <w:r>
-        <w:t>evaluacion</w:t>
+        <w:t>situacion.proceso_evaluacion</w:t>
       </w:r>
       <w:proofErr w:type="spellEnd"/>
       <w:r>
-        <w:t xml:space="preserve"> }</w:t>
-      </w:r>
-      <w:proofErr w:type="gramEnd"/>
-      <w:r>
-        <w:t>}</w:t>
+        <w:t xml:space="preserve"> }}</w:t>
       </w:r>
     </w:p>
     <w:p>
@@ -2233,29 +1740,16 @@
         </w:rPr>
         <w:t xml:space="preserve">Puesta en práctica: </w:t>
       </w:r>
-      <w:proofErr w:type="gramStart"/>
       <w:r>
         <w:t xml:space="preserve">{{ </w:t>
       </w:r>
       <w:proofErr w:type="spellStart"/>
       <w:r>
-        <w:t>situacion</w:t>
-      </w:r>
-      <w:proofErr w:type="gramEnd"/>
-      <w:r>
-        <w:t>.puesta_en_</w:t>
-      </w:r>
-      <w:proofErr w:type="gramStart"/>
-      <w:r>
-        <w:t>practica</w:t>
+        <w:t>situacion.puesta_en_practica</w:t>
       </w:r>
       <w:proofErr w:type="spellEnd"/>
       <w:r>
-        <w:t xml:space="preserve"> }</w:t>
-      </w:r>
-      <w:proofErr w:type="gramEnd"/>
-      <w:r>
-        <w:t>}</w:t>
+        <w:t xml:space="preserve"> }}</w:t>
       </w:r>
     </w:p>
     <w:p>
@@ -2265,66 +1759,19 @@
         </w:rPr>
         <w:t xml:space="preserve">Valoración de la situación de aprendizaje: </w:t>
       </w:r>
-      <w:proofErr w:type="gramStart"/>
       <w:r>
         <w:t xml:space="preserve">{{ </w:t>
       </w:r>
       <w:proofErr w:type="spellStart"/>
       <w:r>
-        <w:t>situacion</w:t>
-      </w:r>
-      <w:proofErr w:type="gramEnd"/>
-      <w:r>
-        <w:t>.</w:t>
-      </w:r>
-      <w:proofErr w:type="gramStart"/>
-      <w:r>
-        <w:t>valoracion</w:t>
+        <w:t>situacion.valoracion</w:t>
       </w:r>
       <w:proofErr w:type="spellEnd"/>
       <w:r>
-        <w:t xml:space="preserve"> }</w:t>
-      </w:r>
-      <w:proofErr w:type="gramEnd"/>
-      <w:r>
-        <w:t>}</w:t>
-      </w:r>
-    </w:p>
-    <w:p>
-      <w:r>
-        <w:rPr>
-          <w:b/>
-          <w:bCs/>
-        </w:rPr>
-        <w:t>Ejemplo</w:t>
-      </w:r>
-      <w:r>
-        <w:t xml:space="preserve">: </w:t>
-      </w:r>
-      <w:proofErr w:type="gramStart"/>
-      <w:r>
-        <w:t xml:space="preserve">{{ </w:t>
-      </w:r>
-      <w:proofErr w:type="spellStart"/>
-      <w:r>
-        <w:t>situacion</w:t>
-      </w:r>
-      <w:proofErr w:type="spellEnd"/>
-      <w:proofErr w:type="gramEnd"/>
-      <w:r>
-        <w:t>.</w:t>
-      </w:r>
-      <w:r>
-        <w:t xml:space="preserve"> </w:t>
-      </w:r>
-      <w:proofErr w:type="spellStart"/>
-      <w:r>
-        <w:t>ejemploSA</w:t>
-      </w:r>
-      <w:proofErr w:type="spellEnd"/>
-      <w:r>
-        <w:t>}}</w:t>
-      </w:r>
+        <w:t xml:space="preserve"> }}</w:t>
+      </w:r>
+    </w:p>
+    <w:p>
       <w:r>
         <w:br/>
       </w:r>
@@ -2375,29 +1822,16 @@
         </w:rPr>
         <w:t xml:space="preserve">Resultados: </w:t>
       </w:r>
-      <w:proofErr w:type="gramStart"/>
       <w:r>
         <w:t xml:space="preserve">{{ </w:t>
       </w:r>
       <w:proofErr w:type="spellStart"/>
       <w:r>
-        <w:t>resultados</w:t>
-      </w:r>
-      <w:proofErr w:type="gramEnd"/>
-      <w:r>
-        <w:t>_evaluacion_</w:t>
-      </w:r>
-      <w:proofErr w:type="gramStart"/>
-      <w:r>
-        <w:t>aprendizajes</w:t>
+        <w:t>resultados_evaluacion_aprendizajes</w:t>
       </w:r>
       <w:proofErr w:type="spellEnd"/>
       <w:r>
-        <w:t xml:space="preserve"> }</w:t>
-      </w:r>
-      <w:proofErr w:type="gramEnd"/>
-      <w:r>
-        <w:t>}</w:t>
+        <w:t xml:space="preserve"> }}</w:t>
       </w:r>
     </w:p>
     <w:p>
@@ -2425,29 +1859,16 @@
         </w:rPr>
         <w:t xml:space="preserve">Revisión: </w:t>
       </w:r>
-      <w:proofErr w:type="gramStart"/>
       <w:r>
         <w:t xml:space="preserve">{{ </w:t>
       </w:r>
       <w:proofErr w:type="spellStart"/>
       <w:r>
-        <w:t>revision</w:t>
-      </w:r>
-      <w:proofErr w:type="gramEnd"/>
-      <w:r>
-        <w:t>_</w:t>
-      </w:r>
-      <w:proofErr w:type="gramStart"/>
-      <w:r>
-        <w:t>programacion</w:t>
+        <w:t>revision_programacion</w:t>
       </w:r>
       <w:proofErr w:type="spellEnd"/>
       <w:r>
-        <w:t xml:space="preserve"> }</w:t>
-      </w:r>
-      <w:proofErr w:type="gramEnd"/>
-      <w:r>
-        <w:t>}</w:t>
+        <w:t xml:space="preserve"> }}</w:t>
       </w:r>
     </w:p>
     <w:p/>

</xml_diff>

<commit_message>
Programación de aula (Word): rellenar tabla_actividades y tabla_indicadores por SA real
Cada columna de P_Aula_SA se empareja ahora con su nº real de SA por
título (tabla SituacionesAprendizaje), no por posición de columna, que
fallaba cuando las columnas no van en orden de SA.

run_programacion_aula acepta resumen_por_sa={título: {indicadores,
actividades}}: la app pasa lo ya calculado en pantalla (valores_actividades
por SA), evitando recalcular sobre fórmulas sin caché tras guardar.

La tabla de actividades del .docx usa las cabeceras del resumen
(A / Descripción / Valor s/ programación / Valor s/ SA).
</commit_message>
<xml_diff>
--- a/templates/programacion_aula_template.docx
+++ b/templates/programacion_aula_template.docx
@@ -1226,8 +1226,13 @@
         <w:lastRenderedPageBreak/>
         <w:t xml:space="preserve">Docente: </w:t>
       </w:r>
-      <w:r>
-        <w:t>{{ docente }}</w:t>
+      <w:proofErr w:type="gramStart"/>
+      <w:r>
+        <w:t>{{ docente</w:t>
+      </w:r>
+      <w:proofErr w:type="gramEnd"/>
+      <w:r>
+        <w:t xml:space="preserve"> }}</w:t>
       </w:r>
     </w:p>
     <w:p>
@@ -1249,16 +1254,29 @@
         </w:rPr>
         <w:t xml:space="preserve">Número de alumnos: </w:t>
       </w:r>
+      <w:proofErr w:type="gramStart"/>
       <w:r>
         <w:t xml:space="preserve">{{ </w:t>
       </w:r>
       <w:proofErr w:type="spellStart"/>
       <w:r>
-        <w:t>numero_alumnos</w:t>
+        <w:t>numero</w:t>
+      </w:r>
+      <w:proofErr w:type="gramEnd"/>
+      <w:r>
+        <w:t>_</w:t>
+      </w:r>
+      <w:proofErr w:type="gramStart"/>
+      <w:r>
+        <w:t>alumnos</w:t>
       </w:r>
       <w:proofErr w:type="spellEnd"/>
       <w:r>
-        <w:t xml:space="preserve"> }}</w:t>
+        <w:t xml:space="preserve"> }</w:t>
+      </w:r>
+      <w:proofErr w:type="gramEnd"/>
+      <w:r>
+        <w:t>}</w:t>
       </w:r>
     </w:p>
     <w:p>
@@ -1268,16 +1286,29 @@
         </w:rPr>
         <w:t xml:space="preserve">Alumnado que requiere atención individualizada: </w:t>
       </w:r>
+      <w:proofErr w:type="gramStart"/>
       <w:r>
         <w:t xml:space="preserve">{{ </w:t>
       </w:r>
       <w:proofErr w:type="spellStart"/>
       <w:r>
-        <w:t>alumnos_atencion_individualizada</w:t>
+        <w:t>alumnos</w:t>
+      </w:r>
+      <w:proofErr w:type="gramEnd"/>
+      <w:r>
+        <w:t>_atencion_</w:t>
+      </w:r>
+      <w:proofErr w:type="gramStart"/>
+      <w:r>
+        <w:t>individualizada</w:t>
       </w:r>
       <w:proofErr w:type="spellEnd"/>
       <w:r>
-        <w:t xml:space="preserve"> }}</w:t>
+        <w:t xml:space="preserve"> }</w:t>
+      </w:r>
+      <w:proofErr w:type="gramEnd"/>
+      <w:r>
+        <w:t>}</w:t>
       </w:r>
     </w:p>
     <w:p>
@@ -1287,16 +1318,29 @@
         </w:rPr>
         <w:t xml:space="preserve">Características físicas, cognitivas y afectivas del grupo: </w:t>
       </w:r>
+      <w:proofErr w:type="gramStart"/>
       <w:r>
         <w:t xml:space="preserve">{{ </w:t>
       </w:r>
       <w:proofErr w:type="spellStart"/>
       <w:r>
-        <w:t>caracteristicas_fisicas_cognitivas_afectivas</w:t>
+        <w:t>caracteristicas</w:t>
+      </w:r>
+      <w:proofErr w:type="gramEnd"/>
+      <w:r>
+        <w:t>_fisicas_cognitivas_</w:t>
+      </w:r>
+      <w:proofErr w:type="gramStart"/>
+      <w:r>
+        <w:t>afectivas</w:t>
       </w:r>
       <w:proofErr w:type="spellEnd"/>
       <w:r>
-        <w:t xml:space="preserve"> }}</w:t>
+        <w:t xml:space="preserve"> }</w:t>
+      </w:r>
+      <w:proofErr w:type="gramEnd"/>
+      <w:r>
+        <w:t>}</w:t>
       </w:r>
     </w:p>
     <w:p>
@@ -1306,16 +1350,29 @@
         </w:rPr>
         <w:t xml:space="preserve">Nivel de competencia curricular: </w:t>
       </w:r>
+      <w:proofErr w:type="gramStart"/>
       <w:r>
         <w:t xml:space="preserve">{{ </w:t>
       </w:r>
       <w:proofErr w:type="spellStart"/>
       <w:r>
-        <w:t>nivel_competencia_curricular</w:t>
+        <w:t>nivel</w:t>
+      </w:r>
+      <w:proofErr w:type="gramEnd"/>
+      <w:r>
+        <w:t>_competencia_</w:t>
+      </w:r>
+      <w:proofErr w:type="gramStart"/>
+      <w:r>
+        <w:t>curricular</w:t>
       </w:r>
       <w:proofErr w:type="spellEnd"/>
       <w:r>
-        <w:t xml:space="preserve"> }}</w:t>
+        <w:t xml:space="preserve"> }</w:t>
+      </w:r>
+      <w:proofErr w:type="gramEnd"/>
+      <w:r>
+        <w:t>}</w:t>
       </w:r>
     </w:p>
     <w:p>
@@ -1325,16 +1382,29 @@
         </w:rPr>
         <w:t xml:space="preserve">Otras características: </w:t>
       </w:r>
+      <w:proofErr w:type="gramStart"/>
       <w:r>
         <w:t xml:space="preserve">{{ </w:t>
       </w:r>
       <w:proofErr w:type="spellStart"/>
       <w:r>
-        <w:t>otras_caracteristicas_grupo</w:t>
+        <w:t>otras</w:t>
+      </w:r>
+      <w:proofErr w:type="gramEnd"/>
+      <w:r>
+        <w:t>_caracteristicas_</w:t>
+      </w:r>
+      <w:proofErr w:type="gramStart"/>
+      <w:r>
+        <w:t>grupo</w:t>
       </w:r>
       <w:proofErr w:type="spellEnd"/>
       <w:r>
-        <w:t xml:space="preserve"> }}</w:t>
+        <w:t xml:space="preserve"> }</w:t>
+      </w:r>
+      <w:proofErr w:type="gramEnd"/>
+      <w:r>
+        <w:t>}</w:t>
       </w:r>
     </w:p>
     <w:p>
@@ -1364,16 +1434,29 @@
         </w:rPr>
         <w:t xml:space="preserve">Resultados: </w:t>
       </w:r>
+      <w:proofErr w:type="gramStart"/>
       <w:r>
         <w:t xml:space="preserve">{{ </w:t>
       </w:r>
       <w:proofErr w:type="spellStart"/>
       <w:r>
-        <w:t>resultados_evaluacion_inicial</w:t>
+        <w:t>resultados</w:t>
+      </w:r>
+      <w:proofErr w:type="gramEnd"/>
+      <w:r>
+        <w:t>_evaluacion_</w:t>
+      </w:r>
+      <w:proofErr w:type="gramStart"/>
+      <w:r>
+        <w:t>inicial</w:t>
       </w:r>
       <w:proofErr w:type="spellEnd"/>
       <w:r>
-        <w:t xml:space="preserve"> }}</w:t>
+        <w:t xml:space="preserve"> }</w:t>
+      </w:r>
+      <w:proofErr w:type="gramEnd"/>
+      <w:r>
+        <w:t>}</w:t>
       </w:r>
     </w:p>
     <w:p>
@@ -1383,16 +1466,29 @@
         </w:rPr>
         <w:t xml:space="preserve">Conclusiones: </w:t>
       </w:r>
+      <w:proofErr w:type="gramStart"/>
       <w:r>
         <w:t xml:space="preserve">{{ </w:t>
       </w:r>
       <w:proofErr w:type="spellStart"/>
       <w:r>
-        <w:t>conclusiones_evaluacion_inicial</w:t>
+        <w:t>conclusiones</w:t>
+      </w:r>
+      <w:proofErr w:type="gramEnd"/>
+      <w:r>
+        <w:t>_evaluacion_</w:t>
+      </w:r>
+      <w:proofErr w:type="gramStart"/>
+      <w:r>
+        <w:t>inicial</w:t>
       </w:r>
       <w:proofErr w:type="spellEnd"/>
       <w:r>
-        <w:t xml:space="preserve"> }}</w:t>
+        <w:t xml:space="preserve"> }</w:t>
+      </w:r>
+      <w:proofErr w:type="gramEnd"/>
+      <w:r>
+        <w:t>}</w:t>
       </w:r>
     </w:p>
     <w:p>
@@ -1441,23 +1537,55 @@
       <w:bookmarkStart w:id="6" w:name="_Toc236808407"/>
       <w:bookmarkStart w:id="7" w:name="_Toc236895668"/>
       <w:r>
-        <w:t xml:space="preserve">Situación de aprendizaje {{ </w:t>
+        <w:t xml:space="preserve">Situación de aprendizaje </w:t>
+      </w:r>
+      <w:proofErr w:type="gramStart"/>
+      <w:r>
+        <w:t xml:space="preserve">{{ </w:t>
       </w:r>
       <w:proofErr w:type="spellStart"/>
       <w:r>
-        <w:t>situacion.numero</w:t>
+        <w:t>situacion</w:t>
+      </w:r>
+      <w:proofErr w:type="gramEnd"/>
+      <w:r>
+        <w:t>.</w:t>
+      </w:r>
+      <w:proofErr w:type="gramStart"/>
+      <w:r>
+        <w:t>numero</w:t>
       </w:r>
       <w:proofErr w:type="spellEnd"/>
       <w:r>
-        <w:t xml:space="preserve"> }}: {{ </w:t>
+        <w:t xml:space="preserve"> }</w:t>
+      </w:r>
+      <w:proofErr w:type="gramEnd"/>
+      <w:r>
+        <w:t xml:space="preserve">}: </w:t>
+      </w:r>
+      <w:proofErr w:type="gramStart"/>
+      <w:r>
+        <w:t xml:space="preserve">{{ </w:t>
       </w:r>
       <w:proofErr w:type="spellStart"/>
       <w:r>
-        <w:t>situacion.titulo</w:t>
+        <w:t>situacion</w:t>
+      </w:r>
+      <w:proofErr w:type="gramEnd"/>
+      <w:r>
+        <w:t>.</w:t>
+      </w:r>
+      <w:proofErr w:type="gramStart"/>
+      <w:r>
+        <w:t>titulo</w:t>
       </w:r>
       <w:proofErr w:type="spellEnd"/>
       <w:r>
-        <w:t xml:space="preserve"> }}</w:t>
+        <w:t xml:space="preserve"> }</w:t>
+      </w:r>
+      <w:proofErr w:type="gramEnd"/>
+      <w:r>
+        <w:t>}</w:t>
       </w:r>
       <w:bookmarkEnd w:id="6"/>
       <w:bookmarkEnd w:id="7"/>
@@ -1469,16 +1597,29 @@
         </w:rPr>
         <w:t xml:space="preserve">Trimestre: </w:t>
       </w:r>
+      <w:proofErr w:type="gramStart"/>
       <w:r>
         <w:t xml:space="preserve">{{ </w:t>
       </w:r>
       <w:proofErr w:type="spellStart"/>
       <w:r>
-        <w:t>situacion.trimestre</w:t>
+        <w:t>situacion</w:t>
+      </w:r>
+      <w:proofErr w:type="gramEnd"/>
+      <w:r>
+        <w:t>.</w:t>
+      </w:r>
+      <w:proofErr w:type="gramStart"/>
+      <w:r>
+        <w:t>trimestre</w:t>
       </w:r>
       <w:proofErr w:type="spellEnd"/>
       <w:r>
-        <w:t xml:space="preserve"> }}</w:t>
+        <w:t xml:space="preserve"> }</w:t>
+      </w:r>
+      <w:proofErr w:type="gramEnd"/>
+      <w:r>
+        <w:t>}</w:t>
       </w:r>
     </w:p>
     <w:p>
@@ -1488,26 +1629,72 @@
         </w:rPr>
         <w:t xml:space="preserve">Contextualización: </w:t>
       </w:r>
+      <w:proofErr w:type="gramStart"/>
       <w:r>
         <w:t xml:space="preserve">{{ </w:t>
       </w:r>
       <w:proofErr w:type="spellStart"/>
       <w:r>
-        <w:t>situacion.contextualizacion</w:t>
+        <w:t>situacion</w:t>
+      </w:r>
+      <w:proofErr w:type="gramEnd"/>
+      <w:r>
+        <w:t>.</w:t>
+      </w:r>
+      <w:proofErr w:type="gramStart"/>
+      <w:r>
+        <w:t>contextualizacion</w:t>
       </w:r>
       <w:proofErr w:type="spellEnd"/>
       <w:r>
-        <w:t xml:space="preserve"> }}</w:t>
-      </w:r>
-    </w:p>
-    <w:p>
-      <w:r>
+        <w:t xml:space="preserve"> }</w:t>
+      </w:r>
+      <w:proofErr w:type="gramEnd"/>
+      <w:r>
+        <w:t>}</w:t>
+      </w:r>
+    </w:p>
+    <w:p>
+      <w:pPr>
+        <w:rPr>
+          <w:b/>
+        </w:rPr>
+      </w:pPr>
+      <w:r>
+        <w:rPr>
+          <w:b/>
+        </w:rPr>
+        <w:t>Elementos curriculares de la situación de aprendizaje:</w:t>
+      </w:r>
+    </w:p>
+    <w:p>
+      <w:pPr>
         <w:rPr>
           <w:i/>
         </w:rPr>
-        <w:t>{{p situacion.tabla_indicadores}}</w:t>
-      </w:r>
-    </w:p>
+      </w:pPr>
+      <w:r>
+        <w:rPr>
+          <w:i/>
+        </w:rPr>
+        <w:t xml:space="preserve">{{p </w:t>
+      </w:r>
+      <w:proofErr w:type="gramStart"/>
+      <w:r>
+        <w:rPr>
+          <w:i/>
+        </w:rPr>
+        <w:t>situacion.tabla</w:t>
+      </w:r>
+      <w:proofErr w:type="gramEnd"/>
+      <w:r>
+        <w:rPr>
+          <w:i/>
+        </w:rPr>
+        <w:t>_indicadores}}</w:t>
+      </w:r>
+    </w:p>
+    <w:p/>
     <w:p>
       <w:r>
         <w:rPr>
@@ -1515,16 +1702,29 @@
         </w:rPr>
         <w:t xml:space="preserve">Contenidos de la materia: </w:t>
       </w:r>
+      <w:proofErr w:type="gramStart"/>
       <w:r>
         <w:t xml:space="preserve">{{ </w:t>
       </w:r>
       <w:proofErr w:type="spellStart"/>
       <w:r>
-        <w:t>situacion.contenidos_materia</w:t>
+        <w:t>situacion</w:t>
+      </w:r>
+      <w:proofErr w:type="gramEnd"/>
+      <w:r>
+        <w:t>.contenidos_</w:t>
+      </w:r>
+      <w:proofErr w:type="gramStart"/>
+      <w:r>
+        <w:t>materia</w:t>
       </w:r>
       <w:proofErr w:type="spellEnd"/>
       <w:r>
-        <w:t xml:space="preserve"> }}</w:t>
+        <w:t xml:space="preserve"> }</w:t>
+      </w:r>
+      <w:proofErr w:type="gramEnd"/>
+      <w:r>
+        <w:t>}</w:t>
       </w:r>
     </w:p>
     <w:p>
@@ -1534,16 +1734,29 @@
         </w:rPr>
         <w:t xml:space="preserve">Contenidos de carácter transversal: </w:t>
       </w:r>
+      <w:proofErr w:type="gramStart"/>
       <w:r>
         <w:t xml:space="preserve">{{ </w:t>
       </w:r>
       <w:proofErr w:type="spellStart"/>
       <w:r>
-        <w:t>situacion.contenidos_transversales</w:t>
+        <w:t>situacion</w:t>
+      </w:r>
+      <w:proofErr w:type="gramEnd"/>
+      <w:r>
+        <w:t>.contenidos_</w:t>
+      </w:r>
+      <w:proofErr w:type="gramStart"/>
+      <w:r>
+        <w:t>transversales</w:t>
       </w:r>
       <w:proofErr w:type="spellEnd"/>
       <w:r>
-        <w:t xml:space="preserve"> }}</w:t>
+        <w:t xml:space="preserve"> }</w:t>
+      </w:r>
+      <w:proofErr w:type="gramEnd"/>
+      <w:r>
+        <w:t>}</w:t>
       </w:r>
     </w:p>
     <w:p>
@@ -1553,16 +1766,29 @@
         </w:rPr>
         <w:t xml:space="preserve">Aprendizaje interdisciplinar: </w:t>
       </w:r>
+      <w:proofErr w:type="gramStart"/>
       <w:r>
         <w:t xml:space="preserve">{{ </w:t>
       </w:r>
       <w:proofErr w:type="spellStart"/>
       <w:r>
-        <w:t>situacion.aprendizaje_interdisciplinar</w:t>
+        <w:t>situacion</w:t>
+      </w:r>
+      <w:proofErr w:type="gramEnd"/>
+      <w:r>
+        <w:t>.aprendizaje_</w:t>
+      </w:r>
+      <w:proofErr w:type="gramStart"/>
+      <w:r>
+        <w:t>interdisciplinar</w:t>
       </w:r>
       <w:proofErr w:type="spellEnd"/>
       <w:r>
-        <w:t xml:space="preserve"> }}</w:t>
+        <w:t xml:space="preserve"> }</w:t>
+      </w:r>
+      <w:proofErr w:type="gramEnd"/>
+      <w:r>
+        <w:t>}</w:t>
       </w:r>
     </w:p>
     <w:p>
@@ -1572,24 +1798,43 @@
         </w:rPr>
         <w:t>Metodología</w:t>
       </w:r>
-    </w:p>
-    <w:p>
       <w:r>
         <w:rPr>
           <w:b/>
         </w:rPr>
+        <w:t>:</w:t>
+      </w:r>
+    </w:p>
+    <w:p>
+      <w:r>
+        <w:rPr>
+          <w:b/>
+        </w:rPr>
         <w:t xml:space="preserve">Métodos (estilos, estrategias y técnicas): </w:t>
       </w:r>
+      <w:proofErr w:type="gramStart"/>
       <w:r>
         <w:t xml:space="preserve">{{ </w:t>
       </w:r>
       <w:proofErr w:type="spellStart"/>
       <w:r>
-        <w:t>situacion.metodos</w:t>
+        <w:t>situacion</w:t>
+      </w:r>
+      <w:proofErr w:type="gramEnd"/>
+      <w:r>
+        <w:t>.</w:t>
+      </w:r>
+      <w:proofErr w:type="gramStart"/>
+      <w:r>
+        <w:t>metodos</w:t>
       </w:r>
       <w:proofErr w:type="spellEnd"/>
       <w:r>
-        <w:t xml:space="preserve"> }}</w:t>
+        <w:t xml:space="preserve"> }</w:t>
+      </w:r>
+      <w:proofErr w:type="gramEnd"/>
+      <w:r>
+        <w:t>}</w:t>
       </w:r>
     </w:p>
     <w:p>
@@ -1599,16 +1844,29 @@
         </w:rPr>
         <w:t xml:space="preserve">Organización del alumnado y agrupamientos: </w:t>
       </w:r>
+      <w:proofErr w:type="gramStart"/>
       <w:r>
         <w:t xml:space="preserve">{{ </w:t>
       </w:r>
       <w:proofErr w:type="spellStart"/>
       <w:r>
-        <w:t>situacion.organizacion_alumnado</w:t>
+        <w:t>situacion</w:t>
+      </w:r>
+      <w:proofErr w:type="gramEnd"/>
+      <w:r>
+        <w:t>.organizacion_</w:t>
+      </w:r>
+      <w:proofErr w:type="gramStart"/>
+      <w:r>
+        <w:t>alumnado</w:t>
       </w:r>
       <w:proofErr w:type="spellEnd"/>
       <w:r>
-        <w:t xml:space="preserve"> }}</w:t>
+        <w:t xml:space="preserve"> }</w:t>
+      </w:r>
+      <w:proofErr w:type="gramEnd"/>
+      <w:r>
+        <w:t>}</w:t>
       </w:r>
     </w:p>
     <w:p>
@@ -1618,16 +1876,29 @@
         </w:rPr>
         <w:t xml:space="preserve">Cronograma y organización del tiempo: </w:t>
       </w:r>
+      <w:proofErr w:type="gramStart"/>
       <w:r>
         <w:t xml:space="preserve">{{ </w:t>
       </w:r>
       <w:proofErr w:type="spellStart"/>
       <w:r>
-        <w:t>situacion.cronograma</w:t>
+        <w:t>situacion</w:t>
+      </w:r>
+      <w:proofErr w:type="gramEnd"/>
+      <w:r>
+        <w:t>.</w:t>
+      </w:r>
+      <w:proofErr w:type="gramStart"/>
+      <w:r>
+        <w:t>cronograma</w:t>
       </w:r>
       <w:proofErr w:type="spellEnd"/>
       <w:r>
-        <w:t xml:space="preserve"> }}</w:t>
+        <w:t xml:space="preserve"> }</w:t>
+      </w:r>
+      <w:proofErr w:type="gramEnd"/>
+      <w:r>
+        <w:t>}</w:t>
       </w:r>
     </w:p>
     <w:p>
@@ -1637,16 +1908,29 @@
         </w:rPr>
         <w:t xml:space="preserve">Organización del espacio: </w:t>
       </w:r>
+      <w:proofErr w:type="gramStart"/>
       <w:r>
         <w:t xml:space="preserve">{{ </w:t>
       </w:r>
       <w:proofErr w:type="spellStart"/>
       <w:r>
-        <w:t>situacion.organizacion_espacio</w:t>
+        <w:t>situacion</w:t>
+      </w:r>
+      <w:proofErr w:type="gramEnd"/>
+      <w:r>
+        <w:t>.organizacion_</w:t>
+      </w:r>
+      <w:proofErr w:type="gramStart"/>
+      <w:r>
+        <w:t>espacio</w:t>
       </w:r>
       <w:proofErr w:type="spellEnd"/>
       <w:r>
-        <w:t xml:space="preserve"> }}</w:t>
+        <w:t xml:space="preserve"> }</w:t>
+      </w:r>
+      <w:proofErr w:type="gramEnd"/>
+      <w:r>
+        <w:t>}</w:t>
       </w:r>
     </w:p>
     <w:p>
@@ -1656,26 +1940,80 @@
         </w:rPr>
         <w:t xml:space="preserve">Materiales y recursos: </w:t>
       </w:r>
+      <w:proofErr w:type="gramStart"/>
       <w:r>
         <w:t xml:space="preserve">{{ </w:t>
       </w:r>
       <w:proofErr w:type="spellStart"/>
       <w:r>
-        <w:t>situacion.materiales_recursos</w:t>
+        <w:t>situacion</w:t>
+      </w:r>
+      <w:proofErr w:type="gramEnd"/>
+      <w:r>
+        <w:t>.materiales_</w:t>
+      </w:r>
+      <w:proofErr w:type="gramStart"/>
+      <w:r>
+        <w:t>recursos</w:t>
       </w:r>
       <w:proofErr w:type="spellEnd"/>
       <w:r>
-        <w:t xml:space="preserve"> }}</w:t>
-      </w:r>
-    </w:p>
-    <w:p>
-      <w:r>
+        <w:t xml:space="preserve"> }</w:t>
+      </w:r>
+      <w:proofErr w:type="gramEnd"/>
+      <w:r>
+        <w:t>}</w:t>
+      </w:r>
+    </w:p>
+    <w:p>
+      <w:pPr>
+        <w:rPr>
+          <w:b/>
+        </w:rPr>
+      </w:pPr>
+      <w:r>
+        <w:rPr>
+          <w:b/>
+        </w:rPr>
+        <w:t>Actividades:</w:t>
+      </w:r>
+    </w:p>
+    <w:p>
+      <w:pPr>
         <w:rPr>
           <w:i/>
         </w:rPr>
-        <w:t>{{p situacion.tabla_actividades}}</w:t>
-      </w:r>
-    </w:p>
+      </w:pPr>
+      <w:r>
+        <w:rPr>
+          <w:i/>
+        </w:rPr>
+        <w:t xml:space="preserve">{{p </w:t>
+      </w:r>
+      <w:proofErr w:type="spellStart"/>
+      <w:proofErr w:type="gramStart"/>
+      <w:r>
+        <w:rPr>
+          <w:i/>
+        </w:rPr>
+        <w:t>situacion.tabla</w:t>
+      </w:r>
+      <w:proofErr w:type="gramEnd"/>
+      <w:r>
+        <w:rPr>
+          <w:i/>
+        </w:rPr>
+        <w:t>_actividades</w:t>
+      </w:r>
+      <w:proofErr w:type="spellEnd"/>
+      <w:r>
+        <w:rPr>
+          <w:i/>
+        </w:rPr>
+        <w:t>}}</w:t>
+      </w:r>
+    </w:p>
+    <w:p/>
     <w:p>
       <w:r>
         <w:rPr>
@@ -1683,16 +2021,29 @@
         </w:rPr>
         <w:t xml:space="preserve">Atención a las diferencias individuales: </w:t>
       </w:r>
+      <w:proofErr w:type="gramStart"/>
       <w:r>
         <w:t xml:space="preserve">{{ </w:t>
       </w:r>
       <w:proofErr w:type="spellStart"/>
       <w:r>
-        <w:t>situacion.atencion_diferencias</w:t>
+        <w:t>situacion</w:t>
+      </w:r>
+      <w:proofErr w:type="gramEnd"/>
+      <w:r>
+        <w:t>.atencion_</w:t>
+      </w:r>
+      <w:proofErr w:type="gramStart"/>
+      <w:r>
+        <w:t>diferencias</w:t>
       </w:r>
       <w:proofErr w:type="spellEnd"/>
       <w:r>
-        <w:t xml:space="preserve"> }}</w:t>
+        <w:t xml:space="preserve"> }</w:t>
+      </w:r>
+      <w:proofErr w:type="gramEnd"/>
+      <w:r>
+        <w:t>}</w:t>
       </w:r>
     </w:p>
     <w:p>
@@ -1702,16 +2053,29 @@
         </w:rPr>
         <w:t xml:space="preserve">Medidas de planes específicos y adaptaciones curriculares: </w:t>
       </w:r>
+      <w:proofErr w:type="gramStart"/>
       <w:r>
         <w:t xml:space="preserve">{{ </w:t>
       </w:r>
       <w:proofErr w:type="spellStart"/>
       <w:r>
-        <w:t>situacion.medidas_especificas</w:t>
+        <w:t>situacion</w:t>
+      </w:r>
+      <w:proofErr w:type="gramEnd"/>
+      <w:r>
+        <w:t>.medidas_</w:t>
+      </w:r>
+      <w:proofErr w:type="gramStart"/>
+      <w:r>
+        <w:t>especificas</w:t>
       </w:r>
       <w:proofErr w:type="spellEnd"/>
       <w:r>
-        <w:t xml:space="preserve"> }}</w:t>
+        <w:t xml:space="preserve"> }</w:t>
+      </w:r>
+      <w:proofErr w:type="gramEnd"/>
+      <w:r>
+        <w:t>}</w:t>
       </w:r>
     </w:p>
     <w:p>
@@ -1721,16 +2085,29 @@
         </w:rPr>
         <w:t xml:space="preserve">Proceso de evaluación: </w:t>
       </w:r>
+      <w:proofErr w:type="gramStart"/>
       <w:r>
         <w:t xml:space="preserve">{{ </w:t>
       </w:r>
       <w:proofErr w:type="spellStart"/>
       <w:r>
-        <w:t>situacion.proceso_evaluacion</w:t>
+        <w:t>situacion</w:t>
+      </w:r>
+      <w:proofErr w:type="gramEnd"/>
+      <w:r>
+        <w:t>.proceso_</w:t>
+      </w:r>
+      <w:proofErr w:type="gramStart"/>
+      <w:r>
+        <w:t>evaluacion</w:t>
       </w:r>
       <w:proofErr w:type="spellEnd"/>
       <w:r>
-        <w:t xml:space="preserve"> }}</w:t>
+        <w:t xml:space="preserve"> }</w:t>
+      </w:r>
+      <w:proofErr w:type="gramEnd"/>
+      <w:r>
+        <w:t>}</w:t>
       </w:r>
     </w:p>
     <w:p>
@@ -1740,16 +2117,29 @@
         </w:rPr>
         <w:t xml:space="preserve">Puesta en práctica: </w:t>
       </w:r>
+      <w:proofErr w:type="gramStart"/>
       <w:r>
         <w:t xml:space="preserve">{{ </w:t>
       </w:r>
       <w:proofErr w:type="spellStart"/>
       <w:r>
-        <w:t>situacion.puesta_en_practica</w:t>
+        <w:t>situacion</w:t>
+      </w:r>
+      <w:proofErr w:type="gramEnd"/>
+      <w:r>
+        <w:t>.puesta_en_</w:t>
+      </w:r>
+      <w:proofErr w:type="gramStart"/>
+      <w:r>
+        <w:t>practica</w:t>
       </w:r>
       <w:proofErr w:type="spellEnd"/>
       <w:r>
-        <w:t xml:space="preserve"> }}</w:t>
+        <w:t xml:space="preserve"> }</w:t>
+      </w:r>
+      <w:proofErr w:type="gramEnd"/>
+      <w:r>
+        <w:t>}</w:t>
       </w:r>
     </w:p>
     <w:p>
@@ -1759,16 +2149,29 @@
         </w:rPr>
         <w:t xml:space="preserve">Valoración de la situación de aprendizaje: </w:t>
       </w:r>
+      <w:proofErr w:type="gramStart"/>
       <w:r>
         <w:t xml:space="preserve">{{ </w:t>
       </w:r>
       <w:proofErr w:type="spellStart"/>
       <w:r>
-        <w:t>situacion.valoracion</w:t>
+        <w:t>situacion</w:t>
+      </w:r>
+      <w:proofErr w:type="gramEnd"/>
+      <w:r>
+        <w:t>.</w:t>
+      </w:r>
+      <w:proofErr w:type="gramStart"/>
+      <w:r>
+        <w:t>valoracion</w:t>
       </w:r>
       <w:proofErr w:type="spellEnd"/>
       <w:r>
-        <w:t xml:space="preserve"> }}</w:t>
+        <w:t xml:space="preserve"> }</w:t>
+      </w:r>
+      <w:proofErr w:type="gramEnd"/>
+      <w:r>
+        <w:t>}</w:t>
       </w:r>
     </w:p>
     <w:p>
@@ -1822,16 +2225,29 @@
         </w:rPr>
         <w:t xml:space="preserve">Resultados: </w:t>
       </w:r>
+      <w:proofErr w:type="gramStart"/>
       <w:r>
         <w:t xml:space="preserve">{{ </w:t>
       </w:r>
       <w:proofErr w:type="spellStart"/>
       <w:r>
-        <w:t>resultados_evaluacion_aprendizajes</w:t>
+        <w:t>resultados</w:t>
+      </w:r>
+      <w:proofErr w:type="gramEnd"/>
+      <w:r>
+        <w:t>_evaluacion_</w:t>
+      </w:r>
+      <w:proofErr w:type="gramStart"/>
+      <w:r>
+        <w:t>aprendizajes</w:t>
       </w:r>
       <w:proofErr w:type="spellEnd"/>
       <w:r>
-        <w:t xml:space="preserve"> }}</w:t>
+        <w:t xml:space="preserve"> }</w:t>
+      </w:r>
+      <w:proofErr w:type="gramEnd"/>
+      <w:r>
+        <w:t>}</w:t>
       </w:r>
     </w:p>
     <w:p>
@@ -1859,16 +2275,29 @@
         </w:rPr>
         <w:t xml:space="preserve">Revisión: </w:t>
       </w:r>
+      <w:proofErr w:type="gramStart"/>
       <w:r>
         <w:t xml:space="preserve">{{ </w:t>
       </w:r>
       <w:proofErr w:type="spellStart"/>
       <w:r>
-        <w:t>revision_programacion</w:t>
+        <w:t>revision</w:t>
+      </w:r>
+      <w:proofErr w:type="gramEnd"/>
+      <w:r>
+        <w:t>_</w:t>
+      </w:r>
+      <w:proofErr w:type="gramStart"/>
+      <w:r>
+        <w:t>programacion</w:t>
       </w:r>
       <w:proofErr w:type="spellEnd"/>
       <w:r>
-        <w:t xml:space="preserve"> }}</w:t>
+        <w:t xml:space="preserve"> }</w:t>
+      </w:r>
+      <w:proofErr w:type="gramEnd"/>
+      <w:r>
+        <w:t>}</w:t>
       </w:r>
     </w:p>
     <w:p/>

</xml_diff>